<commit_message>
edit docs start DiM ms
</commit_message>
<xml_diff>
--- a/doc/massflux.docx
+++ b/doc/massflux.docx
@@ -315,13 +315,7 @@
         <w:rPr>
           <w:rFonts w:ascii="Times New Roman" w:hAnsi="Times New Roman" w:cs="Times New Roman"/>
         </w:rPr>
-        <w:t>scenes with greater cloud fraction</w:t>
-      </w:r>
-      <w:r>
-        <w:rPr>
-          <w:rFonts w:ascii="Times New Roman" w:hAnsi="Times New Roman" w:cs="Times New Roman"/>
-        </w:rPr>
-        <w:t xml:space="preserve"> </w:t>
+        <w:t xml:space="preserve">scenes with greater cloud fraction </w:t>
       </w:r>
       <w:r>
         <w:rPr>
@@ -333,19 +327,7 @@
         <w:rPr>
           <w:rFonts w:ascii="Times New Roman" w:hAnsi="Times New Roman" w:cs="Times New Roman"/>
         </w:rPr>
-        <w:t xml:space="preserve">, </w:t>
-      </w:r>
-      <w:r>
-        <w:rPr>
-          <w:rFonts w:ascii="Times New Roman" w:hAnsi="Times New Roman" w:cs="Times New Roman"/>
-        </w:rPr>
-        <w:t>in the ensemble of cloud top heights observed by satellite</w:t>
-      </w:r>
-      <w:r>
-        <w:rPr>
-          <w:rFonts w:ascii="Times New Roman" w:hAnsi="Times New Roman" w:cs="Times New Roman"/>
-        </w:rPr>
-        <w:t>, consistent with the correlations between clouds and mesoscale mass flux observed in the EUREC4A field campaign</w:t>
+        <w:t>, in the ensemble of cloud top heights observed by satellite, consistent with the correlations between clouds and mesoscale mass flux observed in the EUREC4A field campaign</w:t>
       </w:r>
       <w:r>
         <w:rPr>
@@ -614,7 +596,6 @@
         <w:rPr>
           <w:rFonts w:ascii="Times New Roman" w:hAnsi="Times New Roman" w:cs="Times New Roman"/>
         </w:rPr>
-        <w:lastRenderedPageBreak/>
         <w:t>dropsonde circles</w:t>
       </w:r>
       <w:r>
@@ -1322,14 +1303,7 @@
         <w:rPr>
           <w:rFonts w:ascii="Times New Roman" w:hAnsi="Times New Roman" w:cs="Times New Roman"/>
         </w:rPr>
-        <w:t xml:space="preserve"> northeast of Barbados, away from deeper convection farther south. Figure HUMIDIFF shows the humidity </w:t>
-      </w:r>
-      <w:r>
-        <w:rPr>
-          <w:rFonts w:ascii="Times New Roman" w:hAnsi="Times New Roman" w:cs="Times New Roman"/>
-        </w:rPr>
-        <w:lastRenderedPageBreak/>
-        <w:t xml:space="preserve">observations from these sondes, and the saturation specific humidity </w:t>
+        <w:t xml:space="preserve"> northeast of Barbados, away from deeper convection farther south. Figure HUMIDIFF shows the humidity observations from these sondes, and the saturation specific humidity </w:t>
       </w:r>
       <m:oMath>
         <m:sSub>
@@ -1723,7 +1697,6 @@
         <w:pStyle w:val="Heading3"/>
       </w:pPr>
       <w:r>
-        <w:lastRenderedPageBreak/>
         <w:t>Large scale eddy flux</w:t>
       </w:r>
     </w:p>
@@ -4065,7 +4038,6 @@
         <w:rPr>
           <w:noProof/>
         </w:rPr>
-        <w:lastRenderedPageBreak/>
         <w:drawing>
           <wp:inline distT="0" distB="0" distL="0" distR="0" wp14:anchorId="1D5BB504" wp14:editId="623C1EA3">
             <wp:extent cx="2461467" cy="2749021"/>
@@ -4424,7 +4396,6 @@
         <w:pStyle w:val="Heading2"/>
       </w:pPr>
       <w:r>
-        <w:lastRenderedPageBreak/>
         <w:t>Model</w:t>
       </w:r>
     </w:p>
@@ -7384,16 +7355,8 @@
         <w:rPr>
           <w:rFonts w:ascii="Times New Roman" w:eastAsiaTheme="minorEastAsia" w:hAnsi="Times New Roman" w:cs="Times New Roman"/>
         </w:rPr>
-        <w:t xml:space="preserve">The precipitation </w:t>
-      </w:r>
-      <w:proofErr w:type="gramStart"/>
-      <w:r>
-        <w:rPr>
-          <w:rFonts w:ascii="Times New Roman" w:eastAsiaTheme="minorEastAsia" w:hAnsi="Times New Roman" w:cs="Times New Roman"/>
-        </w:rPr>
-        <w:t>sink</w:t>
-      </w:r>
-      <w:proofErr w:type="gramEnd"/>
+        <w:t>The precipitation sink</w:t>
+      </w:r>
       <w:r>
         <w:rPr>
           <w:rFonts w:ascii="Times New Roman" w:eastAsiaTheme="minorEastAsia" w:hAnsi="Times New Roman" w:cs="Times New Roman"/>
@@ -7624,11 +7587,789 @@
         </w:rPr>
         <w:t xml:space="preserve">. </w:t>
       </w:r>
-      <w:r>
-        <w:rPr>
-          <w:rFonts w:ascii="Times New Roman" w:eastAsiaTheme="minorEastAsia" w:hAnsi="Times New Roman" w:cs="Times New Roman"/>
-        </w:rPr>
-        <w:t>At each height,</w:t>
+    </w:p>
+    <w:p>
+      <w:pPr>
+        <w:pStyle w:val="FirstParagraph"/>
+        <w:rPr>
+          <w:rFonts w:ascii="Times New Roman" w:eastAsiaTheme="minorEastAsia" w:hAnsi="Times New Roman" w:cs="Times New Roman"/>
+        </w:rPr>
+      </w:pPr>
+      <w:r>
+        <w:rPr>
+          <w:rFonts w:ascii="Times New Roman" w:eastAsiaTheme="minorEastAsia" w:hAnsi="Times New Roman" w:cs="Times New Roman"/>
+        </w:rPr>
+        <w:t xml:space="preserve">An example of the all-sky fluxes is computed for a single cloud with </w:t>
+      </w:r>
+      <m:oMath>
+        <m:r>
+          <w:rPr>
+            <w:rFonts w:ascii="Cambria Math" w:eastAsiaTheme="minorEastAsia" w:hAnsi="Cambria Math" w:cs="Times New Roman"/>
+          </w:rPr>
+          <m:t>h=1.7</m:t>
+        </m:r>
+      </m:oMath>
+      <w:r>
+        <w:rPr>
+          <w:rFonts w:ascii="Times New Roman" w:eastAsiaTheme="minorEastAsia" w:hAnsi="Times New Roman" w:cs="Times New Roman"/>
+        </w:rPr>
+        <w:t xml:space="preserve"> km and all-sky cloud-base flux </w:t>
+      </w:r>
+      <m:oMath>
+        <m:r>
+          <w:rPr>
+            <w:rFonts w:ascii="Cambria Math" w:eastAsiaTheme="minorEastAsia" w:hAnsi="Cambria Math" w:cs="Times New Roman"/>
+          </w:rPr>
+          <m:t>G(</m:t>
+        </m:r>
+        <m:sSub>
+          <m:sSubPr>
+            <m:ctrlPr>
+              <w:rPr>
+                <w:rFonts w:ascii="Cambria Math" w:eastAsiaTheme="minorEastAsia" w:hAnsi="Cambria Math" w:cs="Times New Roman"/>
+                <w:i/>
+              </w:rPr>
+            </m:ctrlPr>
+          </m:sSubPr>
+          <m:e>
+            <m:r>
+              <w:rPr>
+                <w:rFonts w:ascii="Cambria Math" w:eastAsiaTheme="minorEastAsia" w:hAnsi="Cambria Math" w:cs="Times New Roman"/>
+              </w:rPr>
+              <m:t>z</m:t>
+            </m:r>
+          </m:e>
+          <m:sub>
+            <m:r>
+              <w:rPr>
+                <w:rFonts w:ascii="Cambria Math" w:eastAsiaTheme="minorEastAsia" w:hAnsi="Cambria Math" w:cs="Times New Roman"/>
+              </w:rPr>
+              <m:t>CB</m:t>
+            </m:r>
+          </m:sub>
+        </m:sSub>
+        <m:r>
+          <w:rPr>
+            <w:rFonts w:ascii="Cambria Math" w:eastAsiaTheme="minorEastAsia" w:hAnsi="Cambria Math" w:cs="Times New Roman"/>
+          </w:rPr>
+          <m:t>)=</m:t>
+        </m:r>
+      </m:oMath>
+      <w:r>
+        <w:rPr>
+          <w:rFonts w:ascii="Times New Roman" w:eastAsiaTheme="minorEastAsia" w:hAnsi="Times New Roman" w:cs="Times New Roman"/>
+        </w:rPr>
+        <w:t xml:space="preserve"> 145 W m</w:t>
+      </w:r>
+      <w:r>
+        <w:rPr>
+          <w:rFonts w:ascii="Times New Roman" w:eastAsiaTheme="minorEastAsia" w:hAnsi="Times New Roman" w:cs="Times New Roman"/>
+          <w:vertAlign w:val="superscript"/>
+        </w:rPr>
+        <w:t>–2</w:t>
+      </w:r>
+      <w:r>
+        <w:rPr>
+          <w:rFonts w:ascii="Times New Roman" w:eastAsiaTheme="minorEastAsia" w:hAnsi="Times New Roman" w:cs="Times New Roman"/>
+        </w:rPr>
+        <w:t xml:space="preserve"> </w:t>
+      </w:r>
+      <m:oMath>
+        <m:r>
+          <w:rPr>
+            <w:rFonts w:ascii="Cambria Math" w:eastAsiaTheme="minorEastAsia" w:hAnsi="Cambria Math" w:cs="Times New Roman"/>
+          </w:rPr>
+          <m:t>=6.0×</m:t>
+        </m:r>
+        <m:sSup>
+          <m:sSupPr>
+            <m:ctrlPr>
+              <w:rPr>
+                <w:rFonts w:ascii="Cambria Math" w:eastAsiaTheme="minorEastAsia" w:hAnsi="Cambria Math" w:cs="Times New Roman"/>
+                <w:i/>
+              </w:rPr>
+            </m:ctrlPr>
+          </m:sSupPr>
+          <m:e>
+            <m:r>
+              <w:rPr>
+                <w:rFonts w:ascii="Cambria Math" w:eastAsiaTheme="minorEastAsia" w:hAnsi="Cambria Math" w:cs="Times New Roman"/>
+              </w:rPr>
+              <m:t>10</m:t>
+            </m:r>
+          </m:e>
+          <m:sup>
+            <m:r>
+              <w:rPr>
+                <w:rFonts w:ascii="Cambria Math" w:eastAsiaTheme="minorEastAsia" w:hAnsi="Cambria Math" w:cs="Times New Roman"/>
+              </w:rPr>
+              <m:t>-5</m:t>
+            </m:r>
+          </m:sup>
+        </m:sSup>
+      </m:oMath>
+      <w:r>
+        <w:rPr>
+          <w:rFonts w:ascii="Times New Roman" w:eastAsiaTheme="minorEastAsia" w:hAnsi="Times New Roman" w:cs="Times New Roman"/>
+        </w:rPr>
+        <w:t xml:space="preserve"> kg m</w:t>
+      </w:r>
+      <w:r>
+        <w:rPr>
+          <w:rFonts w:ascii="Times New Roman" w:eastAsiaTheme="minorEastAsia" w:hAnsi="Times New Roman" w:cs="Times New Roman"/>
+          <w:vertAlign w:val="superscript"/>
+        </w:rPr>
+        <w:t>–2</w:t>
+      </w:r>
+      <w:r>
+        <w:rPr>
+          <w:rFonts w:ascii="Times New Roman" w:eastAsiaTheme="minorEastAsia" w:hAnsi="Times New Roman" w:cs="Times New Roman"/>
+        </w:rPr>
+        <w:t xml:space="preserve"> s</w:t>
+      </w:r>
+      <w:r>
+        <w:rPr>
+          <w:rFonts w:ascii="Times New Roman" w:eastAsiaTheme="minorEastAsia" w:hAnsi="Times New Roman" w:cs="Times New Roman"/>
+          <w:vertAlign w:val="superscript"/>
+        </w:rPr>
+        <w:t>–1</w:t>
+      </w:r>
+      <w:r>
+        <w:rPr>
+          <w:rFonts w:ascii="Times New Roman" w:eastAsiaTheme="minorEastAsia" w:hAnsi="Times New Roman" w:cs="Times New Roman"/>
+        </w:rPr>
+        <w:t xml:space="preserve"> (Fig. QMASSFLX). For this eddy flux </w:t>
+      </w:r>
+      <m:oMath>
+        <m:r>
+          <w:rPr>
+            <w:rFonts w:ascii="Cambria Math" w:eastAsiaTheme="minorEastAsia" w:hAnsi="Cambria Math" w:cs="Times New Roman"/>
+          </w:rPr>
+          <m:t>F</m:t>
+        </m:r>
+      </m:oMath>
+      <w:r>
+        <w:rPr>
+          <w:rFonts w:ascii="Times New Roman" w:eastAsiaTheme="minorEastAsia" w:hAnsi="Times New Roman" w:cs="Times New Roman"/>
+        </w:rPr>
+        <w:t xml:space="preserve"> goes to zero at 8 km. Precipitation increases downward below the cloud top. At a precipitation efficiency of XXX0.5XXX, the cloud-base precipitation </w:t>
+      </w:r>
+      <m:oMath>
+        <m:sSub>
+          <m:sSubPr>
+            <m:ctrlPr>
+              <w:rPr>
+                <w:rFonts w:ascii="Cambria Math" w:eastAsiaTheme="minorEastAsia" w:hAnsi="Cambria Math" w:cs="Times New Roman"/>
+                <w:i/>
+              </w:rPr>
+            </m:ctrlPr>
+          </m:sSubPr>
+          <m:e>
+            <m:r>
+              <w:rPr>
+                <w:rFonts w:ascii="Cambria Math" w:eastAsiaTheme="minorEastAsia" w:hAnsi="Cambria Math" w:cs="Times New Roman"/>
+              </w:rPr>
+              <m:t>P</m:t>
+            </m:r>
+          </m:e>
+          <m:sub>
+            <m:r>
+              <w:rPr>
+                <w:rFonts w:ascii="Cambria Math" w:eastAsiaTheme="minorEastAsia" w:hAnsi="Cambria Math" w:cs="Times New Roman"/>
+              </w:rPr>
+              <m:t>CB</m:t>
+            </m:r>
+          </m:sub>
+        </m:sSub>
+        <m:r>
+          <w:rPr>
+            <w:rFonts w:ascii="Cambria Math" w:eastAsiaTheme="minorEastAsia" w:hAnsi="Cambria Math" w:cs="Times New Roman"/>
+          </w:rPr>
+          <m:t>=|</m:t>
+        </m:r>
+        <m:sSub>
+          <m:sSubPr>
+            <m:ctrlPr>
+              <w:rPr>
+                <w:rFonts w:ascii="Cambria Math" w:eastAsiaTheme="minorEastAsia" w:hAnsi="Cambria Math" w:cs="Times New Roman"/>
+                <w:i/>
+              </w:rPr>
+            </m:ctrlPr>
+          </m:sSubPr>
+          <m:e>
+            <m:r>
+              <w:rPr>
+                <w:rFonts w:ascii="Cambria Math" w:eastAsiaTheme="minorEastAsia" w:hAnsi="Cambria Math" w:cs="Times New Roman"/>
+              </w:rPr>
+              <m:t>F</m:t>
+            </m:r>
+          </m:e>
+          <m:sub>
+            <m:r>
+              <w:rPr>
+                <w:rFonts w:ascii="Cambria Math" w:eastAsiaTheme="minorEastAsia" w:hAnsi="Cambria Math" w:cs="Times New Roman"/>
+              </w:rPr>
+              <m:t>P</m:t>
+            </m:r>
+          </m:sub>
+        </m:sSub>
+        <m:r>
+          <w:rPr>
+            <w:rFonts w:ascii="Cambria Math" w:eastAsiaTheme="minorEastAsia" w:hAnsi="Cambria Math" w:cs="Times New Roman"/>
+          </w:rPr>
+          <m:t>|</m:t>
+        </m:r>
+      </m:oMath>
+      <w:r>
+        <w:rPr>
+          <w:rFonts w:ascii="Times New Roman" w:eastAsiaTheme="minorEastAsia" w:hAnsi="Times New Roman" w:cs="Times New Roman"/>
+        </w:rPr>
+        <w:t xml:space="preserve"> equals the mean surface precipitation, </w:t>
+      </w:r>
+      <m:oMath>
+        <m:sSub>
+          <m:sSubPr>
+            <m:ctrlPr>
+              <w:rPr>
+                <w:rFonts w:ascii="Cambria Math" w:eastAsiaTheme="minorEastAsia" w:hAnsi="Cambria Math" w:cs="Times New Roman"/>
+                <w:i/>
+              </w:rPr>
+            </m:ctrlPr>
+          </m:sSubPr>
+          <m:e>
+            <m:r>
+              <w:rPr>
+                <w:rFonts w:ascii="Cambria Math" w:eastAsiaTheme="minorEastAsia" w:hAnsi="Cambria Math" w:cs="Times New Roman"/>
+              </w:rPr>
+              <m:t>P</m:t>
+            </m:r>
+          </m:e>
+          <m:sub>
+            <m:r>
+              <w:rPr>
+                <w:rFonts w:ascii="Cambria Math" w:eastAsiaTheme="minorEastAsia" w:hAnsi="Cambria Math" w:cs="Times New Roman"/>
+              </w:rPr>
+              <m:t>0</m:t>
+            </m:r>
+          </m:sub>
+        </m:sSub>
+        <m:r>
+          <w:rPr>
+            <w:rFonts w:ascii="Cambria Math" w:eastAsiaTheme="minorEastAsia" w:hAnsi="Cambria Math" w:cs="Times New Roman"/>
+          </w:rPr>
+          <m:t xml:space="preserve">= </m:t>
+        </m:r>
+      </m:oMath>
+      <w:r>
+        <w:rPr>
+          <w:rFonts w:ascii="Times New Roman" w:eastAsiaTheme="minorEastAsia" w:hAnsi="Times New Roman" w:cs="Times New Roman"/>
+        </w:rPr>
+        <w:t>25 W m</w:t>
+      </w:r>
+      <w:r>
+        <w:rPr>
+          <w:rFonts w:ascii="Times New Roman" w:eastAsiaTheme="minorEastAsia" w:hAnsi="Times New Roman" w:cs="Times New Roman"/>
+          <w:vertAlign w:val="superscript"/>
+        </w:rPr>
+        <w:t>–2</w:t>
+      </w:r>
+      <w:r>
+        <w:rPr>
+          <w:rFonts w:ascii="Times New Roman" w:eastAsiaTheme="minorEastAsia" w:hAnsi="Times New Roman" w:cs="Times New Roman"/>
+        </w:rPr>
+        <w:t xml:space="preserve"> </w:t>
+      </w:r>
+      <m:oMath>
+        <m:r>
+          <w:rPr>
+            <w:rFonts w:ascii="Cambria Math" w:eastAsiaTheme="minorEastAsia" w:hAnsi="Cambria Math" w:cs="Times New Roman"/>
+          </w:rPr>
+          <m:t>=9.0×</m:t>
+        </m:r>
+        <m:sSup>
+          <m:sSupPr>
+            <m:ctrlPr>
+              <w:rPr>
+                <w:rFonts w:ascii="Cambria Math" w:eastAsiaTheme="minorEastAsia" w:hAnsi="Cambria Math" w:cs="Times New Roman"/>
+                <w:i/>
+              </w:rPr>
+            </m:ctrlPr>
+          </m:sSupPr>
+          <m:e>
+            <m:r>
+              <w:rPr>
+                <w:rFonts w:ascii="Cambria Math" w:eastAsiaTheme="minorEastAsia" w:hAnsi="Cambria Math" w:cs="Times New Roman"/>
+              </w:rPr>
+              <m:t>10</m:t>
+            </m:r>
+          </m:e>
+          <m:sup>
+            <m:r>
+              <w:rPr>
+                <w:rFonts w:ascii="Cambria Math" w:eastAsiaTheme="minorEastAsia" w:hAnsi="Cambria Math" w:cs="Times New Roman"/>
+              </w:rPr>
+              <m:t>-6</m:t>
+            </m:r>
+          </m:sup>
+        </m:sSup>
+        <m:r>
+          <w:rPr>
+            <w:rFonts w:ascii="Cambria Math" w:eastAsiaTheme="minorEastAsia" w:hAnsi="Cambria Math" w:cs="Times New Roman"/>
+          </w:rPr>
+          <m:t xml:space="preserve"> </m:t>
+        </m:r>
+      </m:oMath>
+      <w:r>
+        <w:rPr>
+          <w:rFonts w:ascii="Times New Roman" w:eastAsiaTheme="minorEastAsia" w:hAnsi="Times New Roman" w:cs="Times New Roman"/>
+        </w:rPr>
+        <w:t>kg m</w:t>
+      </w:r>
+      <w:r>
+        <w:rPr>
+          <w:rFonts w:ascii="Times New Roman" w:eastAsiaTheme="minorEastAsia" w:hAnsi="Times New Roman" w:cs="Times New Roman"/>
+          <w:vertAlign w:val="superscript"/>
+        </w:rPr>
+        <w:t>–2</w:t>
+      </w:r>
+      <w:r>
+        <w:rPr>
+          <w:rFonts w:ascii="Times New Roman" w:eastAsiaTheme="minorEastAsia" w:hAnsi="Times New Roman" w:cs="Times New Roman"/>
+        </w:rPr>
+        <w:t xml:space="preserve"> s</w:t>
+      </w:r>
+      <w:r>
+        <w:rPr>
+          <w:rFonts w:ascii="Times New Roman" w:eastAsiaTheme="minorEastAsia" w:hAnsi="Times New Roman" w:cs="Times New Roman"/>
+          <w:vertAlign w:val="superscript"/>
+        </w:rPr>
+        <w:t>–1</w:t>
+      </w:r>
+      <w:r>
+        <w:rPr>
+          <w:rFonts w:ascii="Times New Roman" w:eastAsiaTheme="minorEastAsia" w:hAnsi="Times New Roman" w:cs="Times New Roman"/>
+        </w:rPr>
+        <w:t xml:space="preserve">, observed on the research vessel </w:t>
+      </w:r>
+      <w:r>
+        <w:rPr>
+          <w:rFonts w:ascii="Times New Roman" w:eastAsiaTheme="minorEastAsia" w:hAnsi="Times New Roman" w:cs="Times New Roman"/>
+          <w:i/>
+          <w:iCs/>
+        </w:rPr>
+        <w:t xml:space="preserve">Ron Brown </w:t>
+      </w:r>
+      <w:r>
+        <w:rPr>
+          <w:rFonts w:ascii="Times New Roman" w:eastAsiaTheme="minorEastAsia" w:hAnsi="Times New Roman" w:cs="Times New Roman"/>
+        </w:rPr>
+        <w:t xml:space="preserve">during EUREC4A/ATOMIC. Evaporation was </w:t>
+      </w:r>
+      <m:oMath>
+        <m:sSub>
+          <m:sSubPr>
+            <m:ctrlPr>
+              <w:rPr>
+                <w:rFonts w:ascii="Cambria Math" w:eastAsiaTheme="minorEastAsia" w:hAnsi="Cambria Math" w:cs="Times New Roman"/>
+                <w:i/>
+              </w:rPr>
+            </m:ctrlPr>
+          </m:sSubPr>
+          <m:e>
+            <m:r>
+              <w:rPr>
+                <w:rFonts w:ascii="Cambria Math" w:eastAsiaTheme="minorEastAsia" w:hAnsi="Cambria Math" w:cs="Times New Roman"/>
+              </w:rPr>
+              <m:t>E</m:t>
+            </m:r>
+          </m:e>
+          <m:sub>
+            <m:r>
+              <w:rPr>
+                <w:rFonts w:ascii="Cambria Math" w:eastAsiaTheme="minorEastAsia" w:hAnsi="Cambria Math" w:cs="Times New Roman"/>
+              </w:rPr>
+              <m:t>0</m:t>
+            </m:r>
+          </m:sub>
+        </m:sSub>
+        <m:r>
+          <w:rPr>
+            <w:rFonts w:ascii="Cambria Math" w:eastAsiaTheme="minorEastAsia" w:hAnsi="Cambria Math" w:cs="Times New Roman"/>
+          </w:rPr>
+          <m:t>=</m:t>
+        </m:r>
+      </m:oMath>
+      <w:r>
+        <w:rPr>
+          <w:rFonts w:ascii="Times New Roman" w:eastAsiaTheme="minorEastAsia" w:hAnsi="Times New Roman" w:cs="Times New Roman"/>
+        </w:rPr>
+        <w:t xml:space="preserve"> 180 W m</w:t>
+      </w:r>
+      <w:r>
+        <w:rPr>
+          <w:rFonts w:ascii="Times New Roman" w:eastAsiaTheme="minorEastAsia" w:hAnsi="Times New Roman" w:cs="Times New Roman"/>
+          <w:vertAlign w:val="superscript"/>
+        </w:rPr>
+        <w:t>–2</w:t>
+      </w:r>
+      <w:r>
+        <w:rPr>
+          <w:rFonts w:ascii="Times New Roman" w:eastAsiaTheme="minorEastAsia" w:hAnsi="Times New Roman" w:cs="Times New Roman"/>
+        </w:rPr>
+        <w:t xml:space="preserve"> </w:t>
+      </w:r>
+      <m:oMath>
+        <m:r>
+          <w:rPr>
+            <w:rFonts w:ascii="Cambria Math" w:eastAsiaTheme="minorEastAsia" w:hAnsi="Cambria Math" w:cs="Times New Roman"/>
+          </w:rPr>
+          <m:t>=6.5×</m:t>
+        </m:r>
+        <m:sSup>
+          <m:sSupPr>
+            <m:ctrlPr>
+              <w:rPr>
+                <w:rFonts w:ascii="Cambria Math" w:eastAsiaTheme="minorEastAsia" w:hAnsi="Cambria Math" w:cs="Times New Roman"/>
+                <w:i/>
+              </w:rPr>
+            </m:ctrlPr>
+          </m:sSupPr>
+          <m:e>
+            <m:r>
+              <w:rPr>
+                <w:rFonts w:ascii="Cambria Math" w:eastAsiaTheme="minorEastAsia" w:hAnsi="Cambria Math" w:cs="Times New Roman"/>
+              </w:rPr>
+              <m:t>10</m:t>
+            </m:r>
+          </m:e>
+          <m:sup>
+            <m:r>
+              <w:rPr>
+                <w:rFonts w:ascii="Cambria Math" w:eastAsiaTheme="minorEastAsia" w:hAnsi="Cambria Math" w:cs="Times New Roman"/>
+              </w:rPr>
+              <m:t>-5</m:t>
+            </m:r>
+          </m:sup>
+        </m:sSup>
+      </m:oMath>
+      <w:r>
+        <w:rPr>
+          <w:rFonts w:ascii="Times New Roman" w:eastAsiaTheme="minorEastAsia" w:hAnsi="Times New Roman" w:cs="Times New Roman"/>
+        </w:rPr>
+        <w:t xml:space="preserve"> kg m</w:t>
+      </w:r>
+      <w:r>
+        <w:rPr>
+          <w:rFonts w:ascii="Times New Roman" w:eastAsiaTheme="minorEastAsia" w:hAnsi="Times New Roman" w:cs="Times New Roman"/>
+          <w:vertAlign w:val="superscript"/>
+        </w:rPr>
+        <w:t>–2</w:t>
+      </w:r>
+      <w:r>
+        <w:rPr>
+          <w:rFonts w:ascii="Times New Roman" w:eastAsiaTheme="minorEastAsia" w:hAnsi="Times New Roman" w:cs="Times New Roman"/>
+        </w:rPr>
+        <w:t xml:space="preserve"> s</w:t>
+      </w:r>
+      <w:r>
+        <w:rPr>
+          <w:rFonts w:ascii="Times New Roman" w:eastAsiaTheme="minorEastAsia" w:hAnsi="Times New Roman" w:cs="Times New Roman"/>
+          <w:vertAlign w:val="superscript"/>
+        </w:rPr>
+        <w:t>–1</w:t>
+      </w:r>
+      <w:r>
+        <w:rPr>
+          <w:rFonts w:ascii="Times New Roman" w:eastAsiaTheme="minorEastAsia" w:hAnsi="Times New Roman" w:cs="Times New Roman"/>
+        </w:rPr>
+        <w:t xml:space="preserve">. The mass flux is </w:t>
+      </w:r>
+      <m:oMath>
+        <m:r>
+          <w:rPr>
+            <w:rFonts w:ascii="Cambria Math" w:eastAsiaTheme="minorEastAsia" w:hAnsi="Cambria Math" w:cs="Times New Roman"/>
+          </w:rPr>
+          <m:t>M=</m:t>
+        </m:r>
+        <m:sSub>
+          <m:sSubPr>
+            <m:ctrlPr>
+              <w:rPr>
+                <w:rFonts w:ascii="Cambria Math" w:eastAsiaTheme="minorEastAsia" w:hAnsi="Cambria Math" w:cs="Times New Roman"/>
+                <w:i/>
+              </w:rPr>
+            </m:ctrlPr>
+          </m:sSubPr>
+          <m:e>
+            <m:r>
+              <w:rPr>
+                <w:rFonts w:ascii="Cambria Math" w:eastAsiaTheme="minorEastAsia" w:hAnsi="Cambria Math" w:cs="Times New Roman"/>
+              </w:rPr>
+              <m:t>G</m:t>
+            </m:r>
+          </m:e>
+          <m:sub>
+            <m:r>
+              <w:rPr>
+                <w:rFonts w:ascii="Cambria Math" w:eastAsiaTheme="minorEastAsia" w:hAnsi="Cambria Math" w:cs="Times New Roman"/>
+              </w:rPr>
+              <m:t>cld</m:t>
+            </m:r>
+          </m:sub>
+        </m:sSub>
+        <m:r>
+          <w:rPr>
+            <w:rFonts w:ascii="Cambria Math" w:eastAsiaTheme="minorEastAsia" w:hAnsi="Cambria Math" w:cs="Times New Roman"/>
+          </w:rPr>
+          <m:t>/(</m:t>
+        </m:r>
+        <m:sSub>
+          <m:sSubPr>
+            <m:ctrlPr>
+              <w:rPr>
+                <w:rFonts w:ascii="Cambria Math" w:eastAsiaTheme="minorEastAsia" w:hAnsi="Cambria Math" w:cs="Times New Roman"/>
+                <w:i/>
+              </w:rPr>
+            </m:ctrlPr>
+          </m:sSubPr>
+          <m:e>
+            <m:r>
+              <w:rPr>
+                <w:rFonts w:ascii="Cambria Math" w:eastAsiaTheme="minorEastAsia" w:hAnsi="Cambria Math" w:cs="Times New Roman"/>
+              </w:rPr>
+              <m:t>q</m:t>
+            </m:r>
+          </m:e>
+          <m:sub>
+            <m:r>
+              <w:rPr>
+                <w:rFonts w:ascii="Cambria Math" w:eastAsiaTheme="minorEastAsia" w:hAnsi="Cambria Math" w:cs="Times New Roman"/>
+              </w:rPr>
+              <m:t>T</m:t>
+            </m:r>
+          </m:sub>
+        </m:sSub>
+        <m:r>
+          <w:rPr>
+            <w:rFonts w:ascii="Cambria Math" w:eastAsiaTheme="minorEastAsia" w:hAnsi="Cambria Math" w:cs="Times New Roman"/>
+          </w:rPr>
+          <m:t xml:space="preserve">-q) </m:t>
+        </m:r>
+      </m:oMath>
+      <w:r>
+        <w:rPr>
+          <w:rFonts w:ascii="Times New Roman" w:eastAsiaTheme="minorEastAsia" w:hAnsi="Times New Roman" w:cs="Times New Roman"/>
+        </w:rPr>
+        <w:t xml:space="preserve">(Fig. QMASSFLX). Most of the flux (XX %) is below 3 km in the trade cumulus layer. Most of the updraft moisture </w:t>
+      </w:r>
+      <m:oMath>
+        <m:sSub>
+          <m:sSubPr>
+            <m:ctrlPr>
+              <w:rPr>
+                <w:rFonts w:ascii="Cambria Math" w:eastAsiaTheme="minorEastAsia" w:hAnsi="Cambria Math" w:cs="Times New Roman"/>
+                <w:i/>
+              </w:rPr>
+            </m:ctrlPr>
+          </m:sSubPr>
+          <m:e>
+            <m:r>
+              <w:rPr>
+                <w:rFonts w:ascii="Cambria Math" w:eastAsiaTheme="minorEastAsia" w:hAnsi="Cambria Math" w:cs="Times New Roman"/>
+              </w:rPr>
+              <m:t>q</m:t>
+            </m:r>
+          </m:e>
+          <m:sub>
+            <m:r>
+              <w:rPr>
+                <w:rFonts w:ascii="Cambria Math" w:eastAsiaTheme="minorEastAsia" w:hAnsi="Cambria Math" w:cs="Times New Roman"/>
+              </w:rPr>
+              <m:t>T</m:t>
+            </m:r>
+          </m:sub>
+        </m:sSub>
+      </m:oMath>
+      <w:r>
+        <w:rPr>
+          <w:rFonts w:ascii="Times New Roman" w:eastAsiaTheme="minorEastAsia" w:hAnsi="Times New Roman" w:cs="Times New Roman"/>
+        </w:rPr>
+        <w:t xml:space="preserve"> is vapor, and the moist updraft </w:t>
+      </w:r>
+      <m:oMath>
+        <m:sSub>
+          <m:sSubPr>
+            <m:ctrlPr>
+              <w:rPr>
+                <w:rFonts w:ascii="Cambria Math" w:eastAsiaTheme="minorEastAsia" w:hAnsi="Cambria Math" w:cs="Times New Roman"/>
+                <w:i/>
+              </w:rPr>
+            </m:ctrlPr>
+          </m:sSubPr>
+          <m:e>
+            <m:r>
+              <w:rPr>
+                <w:rFonts w:ascii="Cambria Math" w:eastAsiaTheme="minorEastAsia" w:hAnsi="Cambria Math" w:cs="Times New Roman"/>
+              </w:rPr>
+              <m:t>q</m:t>
+            </m:r>
+          </m:e>
+          <m:sub>
+            <m:r>
+              <w:rPr>
+                <w:rFonts w:ascii="Cambria Math" w:eastAsiaTheme="minorEastAsia" w:hAnsi="Cambria Math" w:cs="Times New Roman"/>
+              </w:rPr>
+              <m:t>T</m:t>
+            </m:r>
+          </m:sub>
+        </m:sSub>
+        <m:r>
+          <w:rPr>
+            <w:rFonts w:ascii="Cambria Math" w:eastAsiaTheme="minorEastAsia" w:hAnsi="Cambria Math" w:cs="Times New Roman"/>
+          </w:rPr>
+          <m:t>-q&gt;0</m:t>
+        </m:r>
+      </m:oMath>
+      <w:r>
+        <w:rPr>
+          <w:rFonts w:ascii="Times New Roman" w:eastAsiaTheme="minorEastAsia" w:hAnsi="Times New Roman" w:cs="Times New Roman"/>
+        </w:rPr>
+        <w:t xml:space="preserve"> generates upward moisture flux, even above the cloud.</w:t>
+      </w:r>
+    </w:p>
+    <w:p>
+      <w:pPr>
+        <w:pStyle w:val="BodyText"/>
+        <w:rPr>
+          <w:rFonts w:ascii="Aptos Narrow" w:eastAsia="Times New Roman" w:hAnsi="Aptos Narrow" w:cstheme="minorHAnsi"/>
+          <w:color w:val="323130"/>
+        </w:rPr>
+      </w:pPr>
+      <w:r>
+        <w:rPr>
+          <w:rFonts w:ascii="Aptos Narrow" w:eastAsia="Times New Roman" w:hAnsi="Aptos Narrow" w:cstheme="minorHAnsi"/>
+          <w:noProof/>
+          <w:color w:val="323130"/>
+        </w:rPr>
+        <w:drawing>
+          <wp:inline distT="0" distB="0" distL="0" distR="0" wp14:anchorId="28FD53AB" wp14:editId="197F7DBF">
+            <wp:extent cx="2198092" cy="3937924"/>
+            <wp:effectExtent l="0" t="0" r="0" b="0"/>
+            <wp:docPr id="1217897602" name="Picture 1" descr="A graph of height and height&#10;&#10;AI-generated content may be incorrect."/>
+            <wp:cNvGraphicFramePr>
+              <a:graphicFrameLocks xmlns:a="http://schemas.openxmlformats.org/drawingml/2006/main" noChangeAspect="1"/>
+            </wp:cNvGraphicFramePr>
+            <a:graphic xmlns:a="http://schemas.openxmlformats.org/drawingml/2006/main">
+              <a:graphicData uri="http://schemas.openxmlformats.org/drawingml/2006/picture">
+                <pic:pic xmlns:pic="http://schemas.openxmlformats.org/drawingml/2006/picture">
+                  <pic:nvPicPr>
+                    <pic:cNvPr id="620853185" name="Picture 1" descr="A graph of height and height&#10;&#10;AI-generated content may be incorrect."/>
+                    <pic:cNvPicPr/>
+                  </pic:nvPicPr>
+                  <pic:blipFill>
+                    <a:blip r:embed="rId10"/>
+                    <a:stretch>
+                      <a:fillRect/>
+                    </a:stretch>
+                  </pic:blipFill>
+                  <pic:spPr>
+                    <a:xfrm>
+                      <a:off x="0" y="0"/>
+                      <a:ext cx="2205243" cy="3950735"/>
+                    </a:xfrm>
+                    <a:prstGeom prst="rect">
+                      <a:avLst/>
+                    </a:prstGeom>
+                  </pic:spPr>
+                </pic:pic>
+              </a:graphicData>
+            </a:graphic>
+          </wp:inline>
+        </w:drawing>
+      </w:r>
+    </w:p>
+    <w:p>
+      <w:pPr>
+        <w:pStyle w:val="BodyText"/>
+        <w:rPr>
+          <w:rFonts w:ascii="Aptos Narrow" w:eastAsia="Times New Roman" w:hAnsi="Aptos Narrow" w:cstheme="minorHAnsi"/>
+          <w:color w:val="323130"/>
+        </w:rPr>
+      </w:pPr>
+      <w:r>
+        <w:rPr>
+          <w:rFonts w:ascii="Aptos Narrow" w:eastAsia="Times New Roman" w:hAnsi="Aptos Narrow" w:cstheme="minorHAnsi"/>
+          <w:color w:val="323130"/>
+        </w:rPr>
+        <w:t>Figure QMASSFLX. Total moisture flux to balance the large-scale moisture sink (blue), cloud moisture flux (orange), and (downward) precipitation flux (green), and mass flux (red) from the model.</w:t>
+      </w:r>
+    </w:p>
+    <w:p>
+      <w:pPr>
+        <w:pStyle w:val="BodyText"/>
+        <w:rPr>
+          <w:rFonts w:ascii="Times New Roman" w:eastAsiaTheme="minorEastAsia" w:hAnsi="Times New Roman" w:cs="Times New Roman"/>
+        </w:rPr>
+      </w:pPr>
+    </w:p>
+    <w:p>
+      <w:pPr>
+        <w:pStyle w:val="Heading30"/>
+        <w:rPr>
+          <w:rFonts w:eastAsiaTheme="minorEastAsia"/>
+        </w:rPr>
+      </w:pPr>
+      <w:r>
+        <w:rPr>
+          <w:rFonts w:eastAsiaTheme="minorEastAsia"/>
+        </w:rPr>
+        <w:t>Appendix: n</w:t>
+      </w:r>
+      <w:r>
+        <w:rPr>
+          <w:rFonts w:eastAsiaTheme="minorEastAsia"/>
+        </w:rPr>
+        <w:t xml:space="preserve">umerical </w:t>
+      </w:r>
+      <w:r>
+        <w:rPr>
+          <w:rFonts w:eastAsiaTheme="minorEastAsia"/>
+        </w:rPr>
+        <w:t>solution</w:t>
+      </w:r>
+    </w:p>
+    <w:p>
+      <w:pPr>
+        <w:pStyle w:val="BodyText"/>
+        <w:rPr>
+          <w:rFonts w:ascii="Times New Roman" w:eastAsiaTheme="minorEastAsia" w:hAnsi="Times New Roman" w:cs="Times New Roman"/>
+        </w:rPr>
+      </w:pPr>
+      <w:r>
+        <w:rPr>
+          <w:rFonts w:ascii="Times New Roman" w:eastAsiaTheme="minorEastAsia" w:hAnsi="Times New Roman" w:cs="Times New Roman"/>
+        </w:rPr>
+        <w:t>At each height</w:t>
+      </w:r>
+      <w:r>
+        <w:rPr>
+          <w:rFonts w:ascii="Times New Roman" w:eastAsiaTheme="minorEastAsia" w:hAnsi="Times New Roman" w:cs="Times New Roman"/>
+        </w:rPr>
+        <w:t xml:space="preserve"> and for each cloud category </w:t>
+      </w:r>
+      <m:oMath>
+        <m:r>
+          <w:rPr>
+            <w:rFonts w:ascii="Cambria Math" w:eastAsiaTheme="minorEastAsia" w:hAnsi="Cambria Math" w:cs="Times New Roman"/>
+          </w:rPr>
+          <m:t>i</m:t>
+        </m:r>
+      </m:oMath>
+      <w:r>
+        <w:rPr>
+          <w:rFonts w:ascii="Times New Roman" w:eastAsiaTheme="minorEastAsia" w:hAnsi="Times New Roman" w:cs="Times New Roman"/>
+        </w:rPr>
+        <w:t>,</w:t>
       </w:r>
       <w:r>
         <w:rPr>
@@ -8093,7 +8834,19 @@
         <w:rPr>
           <w:rFonts w:ascii="Times New Roman" w:eastAsiaTheme="minorEastAsia" w:hAnsi="Times New Roman" w:cs="Times New Roman"/>
         </w:rPr>
-        <w:t xml:space="preserve">We integrate downward from </w:t>
+        <w:t xml:space="preserve">We integrate </w:t>
+      </w:r>
+      <w:r>
+        <w:rPr>
+          <w:rFonts w:ascii="Times New Roman" w:eastAsiaTheme="minorEastAsia" w:hAnsi="Times New Roman" w:cs="Times New Roman"/>
+        </w:rPr>
+        <w:t xml:space="preserve">precipitation </w:t>
+      </w:r>
+      <w:r>
+        <w:rPr>
+          <w:rFonts w:ascii="Times New Roman" w:eastAsiaTheme="minorEastAsia" w:hAnsi="Times New Roman" w:cs="Times New Roman"/>
+        </w:rPr>
+        <w:t xml:space="preserve">downward from </w:t>
       </w:r>
       <w:r>
         <w:rPr>
@@ -8195,7 +8948,19 @@
         <w:rPr>
           <w:rFonts w:ascii="Times New Roman" w:eastAsiaTheme="minorEastAsia" w:hAnsi="Times New Roman" w:cs="Times New Roman"/>
         </w:rPr>
-        <w:t xml:space="preserve">, with trapezoidal </w:t>
+        <w:t xml:space="preserve">, </w:t>
+      </w:r>
+      <w:r>
+        <w:rPr>
+          <w:rFonts w:ascii="Times New Roman" w:eastAsiaTheme="minorEastAsia" w:hAnsi="Times New Roman" w:cs="Times New Roman"/>
+        </w:rPr>
+        <w:t>in</w:t>
+      </w:r>
+      <w:r>
+        <w:rPr>
+          <w:rFonts w:ascii="Times New Roman" w:eastAsiaTheme="minorEastAsia" w:hAnsi="Times New Roman" w:cs="Times New Roman"/>
+        </w:rPr>
+        <w:t xml:space="preserve"> trapezoidal </w:t>
       </w:r>
       <w:r>
         <w:rPr>
@@ -8207,14 +8972,14 @@
         <w:rPr>
           <w:rFonts w:ascii="Times New Roman" w:eastAsiaTheme="minorEastAsia" w:hAnsi="Times New Roman" w:cs="Times New Roman"/>
         </w:rPr>
-        <w:t xml:space="preserve">steps (denoted by superscripts </w:t>
+        <w:t xml:space="preserve">steps denoted by superscripts </w:t>
       </w:r>
       <m:oMath>
         <m:r>
           <w:rPr>
             <w:rFonts w:ascii="Cambria Math" w:eastAsiaTheme="minorEastAsia" w:hAnsi="Cambria Math" w:cs="Times New Roman"/>
           </w:rPr>
-          <m:t>k)</m:t>
+          <m:t>k</m:t>
         </m:r>
       </m:oMath>
       <w:r>
@@ -9576,74 +10341,6 @@
     </w:p>
     <w:p>
       <w:pPr>
-        <w:pStyle w:val="BodyText"/>
-        <w:rPr>
-          <w:rFonts w:ascii="Aptos Narrow" w:eastAsia="Times New Roman" w:hAnsi="Aptos Narrow" w:cstheme="minorHAnsi"/>
-          <w:color w:val="323130"/>
-        </w:rPr>
-      </w:pPr>
-      <w:r>
-        <w:rPr>
-          <w:rFonts w:ascii="Aptos Narrow" w:eastAsia="Times New Roman" w:hAnsi="Aptos Narrow" w:cstheme="minorHAnsi"/>
-          <w:noProof/>
-          <w:color w:val="323130"/>
-        </w:rPr>
-        <w:lastRenderedPageBreak/>
-        <w:drawing>
-          <wp:inline distT="0" distB="0" distL="0" distR="0" wp14:anchorId="71862B27" wp14:editId="43326FF4">
-            <wp:extent cx="2198092" cy="3937924"/>
-            <wp:effectExtent l="0" t="0" r="0" b="0"/>
-            <wp:docPr id="620853185" name="Picture 1" descr="A graph of height and height&#10;&#10;AI-generated content may be incorrect."/>
-            <wp:cNvGraphicFramePr>
-              <a:graphicFrameLocks xmlns:a="http://schemas.openxmlformats.org/drawingml/2006/main" noChangeAspect="1"/>
-            </wp:cNvGraphicFramePr>
-            <a:graphic xmlns:a="http://schemas.openxmlformats.org/drawingml/2006/main">
-              <a:graphicData uri="http://schemas.openxmlformats.org/drawingml/2006/picture">
-                <pic:pic xmlns:pic="http://schemas.openxmlformats.org/drawingml/2006/picture">
-                  <pic:nvPicPr>
-                    <pic:cNvPr id="620853185" name="Picture 1" descr="A graph of height and height&#10;&#10;AI-generated content may be incorrect."/>
-                    <pic:cNvPicPr/>
-                  </pic:nvPicPr>
-                  <pic:blipFill>
-                    <a:blip r:embed="rId10"/>
-                    <a:stretch>
-                      <a:fillRect/>
-                    </a:stretch>
-                  </pic:blipFill>
-                  <pic:spPr>
-                    <a:xfrm>
-                      <a:off x="0" y="0"/>
-                      <a:ext cx="2205243" cy="3950735"/>
-                    </a:xfrm>
-                    <a:prstGeom prst="rect">
-                      <a:avLst/>
-                    </a:prstGeom>
-                  </pic:spPr>
-                </pic:pic>
-              </a:graphicData>
-            </a:graphic>
-          </wp:inline>
-        </w:drawing>
-      </w:r>
-    </w:p>
-    <w:p>
-      <w:pPr>
-        <w:pStyle w:val="BodyText"/>
-        <w:rPr>
-          <w:rFonts w:ascii="Aptos Narrow" w:eastAsia="Times New Roman" w:hAnsi="Aptos Narrow" w:cstheme="minorHAnsi"/>
-          <w:color w:val="323130"/>
-        </w:rPr>
-      </w:pPr>
-      <w:r>
-        <w:rPr>
-          <w:rFonts w:ascii="Aptos Narrow" w:eastAsia="Times New Roman" w:hAnsi="Aptos Narrow" w:cstheme="minorHAnsi"/>
-          <w:color w:val="323130"/>
-        </w:rPr>
-        <w:t>Figure QMASSFLX. Total moisture flux to balance the large-scale moisture sink (blue), cloud moisture flux (orange), and (downward) precipitation flux (green), and mass flux (red) from the model.</w:t>
-      </w:r>
-    </w:p>
-    <w:p>
-      <w:pPr>
         <w:rPr>
           <w:rFonts w:ascii="Times New Roman" w:eastAsiaTheme="minorEastAsia" w:hAnsi="Times New Roman" w:cs="Times New Roman"/>
         </w:rPr>
@@ -10180,7 +10877,6 @@
           <w:rFonts w:ascii="Times New Roman" w:eastAsiaTheme="minorEastAsia" w:hAnsi="Times New Roman" w:cs="Times New Roman"/>
           <w:noProof/>
         </w:rPr>
-        <w:lastRenderedPageBreak/>
         <w:drawing>
           <wp:inline distT="0" distB="0" distL="0" distR="0" wp14:anchorId="6D088989" wp14:editId="579621ED">
             <wp:extent cx="4631961" cy="3699022"/>
@@ -10883,7 +11579,6 @@
           <w:rFonts w:ascii="Times New Roman" w:eastAsiaTheme="minorEastAsia" w:hAnsi="Times New Roman" w:cs="Times New Roman"/>
           <w:noProof/>
         </w:rPr>
-        <w:lastRenderedPageBreak/>
         <w:drawing>
           <wp:inline distT="0" distB="0" distL="0" distR="0" wp14:anchorId="7A3013D2" wp14:editId="2C31154D">
             <wp:extent cx="4427316" cy="3530745"/>
@@ -11296,7 +11991,6 @@
           <w:rFonts w:ascii="Aptos Narrow" w:eastAsiaTheme="minorEastAsia" w:hAnsi="Aptos Narrow" w:cs="Times New Roman"/>
           <w:noProof/>
         </w:rPr>
-        <w:lastRenderedPageBreak/>
         <w:drawing>
           <wp:inline distT="0" distB="0" distL="0" distR="0" wp14:anchorId="65F40AEF" wp14:editId="5E544D43">
             <wp:extent cx="3070445" cy="4346714"/>
@@ -12672,7 +13366,6 @@
           <w:rFonts w:ascii="Times New Roman" w:eastAsiaTheme="minorEastAsia" w:hAnsi="Times New Roman" w:cs="Times New Roman"/>
           <w:noProof/>
         </w:rPr>
-        <w:lastRenderedPageBreak/>
         <w:drawing>
           <wp:inline distT="0" distB="0" distL="0" distR="0" wp14:anchorId="1D66F9C9" wp14:editId="77E6AA8C">
             <wp:extent cx="3602403" cy="1428750"/>
@@ -13485,7 +14178,6 @@
           <w:rFonts w:ascii="Times New Roman" w:eastAsiaTheme="minorEastAsia" w:hAnsi="Times New Roman" w:cs="Times New Roman"/>
           <w:noProof/>
         </w:rPr>
-        <w:lastRenderedPageBreak/>
         <w:drawing>
           <wp:inline distT="0" distB="0" distL="0" distR="0" wp14:anchorId="0971D351" wp14:editId="00A6750C">
             <wp:extent cx="2870200" cy="4356100"/>
@@ -13715,7 +14407,6 @@
           <w:rFonts w:ascii="Aptos Narrow" w:eastAsiaTheme="minorEastAsia" w:hAnsi="Aptos Narrow" w:cs="Times New Roman"/>
           <w:noProof/>
         </w:rPr>
-        <w:lastRenderedPageBreak/>
         <w:drawing>
           <wp:inline distT="0" distB="0" distL="0" distR="0" wp14:anchorId="610233A2" wp14:editId="5393CE26">
             <wp:extent cx="3759200" cy="2971800"/>
@@ -14017,14 +14708,7 @@
         <w:rPr>
           <w:rFonts w:eastAsiaTheme="minorEastAsia"/>
         </w:rPr>
-        <w:t xml:space="preserve">the steady total (vapor + </w:t>
-      </w:r>
-      <w:r>
-        <w:rPr>
-          <w:rFonts w:eastAsiaTheme="minorEastAsia"/>
-        </w:rPr>
-        <w:lastRenderedPageBreak/>
-        <w:t xml:space="preserve">liquid) cloud water specific humidity </w:t>
+        <w:t xml:space="preserve">the steady total (vapor + liquid) cloud water specific humidity </w:t>
       </w:r>
       <m:oMath>
         <m:sSub>
@@ -16257,7 +16941,6 @@
         <w:rPr>
           <w:rFonts w:eastAsiaTheme="minorEastAsia"/>
         </w:rPr>
-        <w:lastRenderedPageBreak/>
         <w:t>Explicitly simulating the large-scale subsidence of the assumed isotope profile,</w:t>
       </w:r>
       <w:r>
@@ -16717,15 +17400,7 @@
           <w:rFonts w:ascii="Aptos Narrow" w:eastAsia="Times New Roman" w:hAnsi="Aptos Narrow" w:cstheme="minorHAnsi"/>
           <w:color w:val="323130"/>
         </w:rPr>
-        <w:t xml:space="preserve">. Cloud total and vapor deuterium isotope ratios for 4 cloud experiments </w:t>
-      </w:r>
-      <w:r>
-        <w:rPr>
-          <w:rFonts w:ascii="Aptos Narrow" w:eastAsia="Times New Roman" w:hAnsi="Aptos Narrow" w:cstheme="minorHAnsi"/>
-          <w:color w:val="323130"/>
-        </w:rPr>
-        <w:lastRenderedPageBreak/>
-        <w:t xml:space="preserve">with entrainment rate of </w:t>
+        <w:t xml:space="preserve">. Cloud total and vapor deuterium isotope ratios for 4 cloud experiments with entrainment rate of </w:t>
       </w:r>
       <m:oMath>
         <m:r>
@@ -17275,7 +17950,6 @@
           <w:noProof/>
           <w:color w:val="323130"/>
         </w:rPr>
-        <w:lastRenderedPageBreak/>
         <w:drawing>
           <wp:inline distT="0" distB="0" distL="0" distR="0" wp14:anchorId="1250CBD9" wp14:editId="40A8FF8D">
             <wp:extent cx="3746500" cy="2895600"/>
@@ -17506,15 +18180,7 @@
           <w:rFonts w:ascii="Times New Roman" w:eastAsiaTheme="minorEastAsia" w:hAnsi="Times New Roman" w:cs="Times New Roman"/>
           <w:highlight w:val="lightGray"/>
         </w:rPr>
-        <w:t xml:space="preserve">balance large scale advection and subsidence. Most of this moisture flux is below 3 km and most of the mass flux is below 2 km. The cloud and total eddy moisture flux balance subsidence drying at the strong moisture </w:t>
-      </w:r>
-      <w:r>
-        <w:rPr>
-          <w:rFonts w:ascii="Times New Roman" w:eastAsiaTheme="minorEastAsia" w:hAnsi="Times New Roman" w:cs="Times New Roman"/>
-          <w:highlight w:val="lightGray"/>
-        </w:rPr>
-        <w:lastRenderedPageBreak/>
-        <w:t>derivative at the top of the trade cumulus layer at 2-3 km. The strong difference at 2-3 km between the dry environment and the cloud updraft, whose specific humidity is proportional to the saturation specific humidity, achieves the moisture flux there. Precipitation is zero at cloud top (1.7 km) and integrates downward proportional to cloud liquid water, confining it in the lower cloud layer.</w:t>
+        <w:t>balance large scale advection and subsidence. Most of this moisture flux is below 3 km and most of the mass flux is below 2 km. The cloud and total eddy moisture flux balance subsidence drying at the strong moisture derivative at the top of the trade cumulus layer at 2-3 km. The strong difference at 2-3 km between the dry environment and the cloud updraft, whose specific humidity is proportional to the saturation specific humidity, achieves the moisture flux there. Precipitation is zero at cloud top (1.7 km) and integrates downward proportional to cloud liquid water, confining it in the lower cloud layer.</w:t>
       </w:r>
     </w:p>
     <w:p>
@@ -18510,7 +19176,6 @@
         <w:rPr>
           <w:rFonts w:ascii="Times New Roman" w:eastAsiaTheme="minorEastAsia" w:hAnsi="Times New Roman" w:cs="Times New Roman"/>
         </w:rPr>
-        <w:lastRenderedPageBreak/>
         <w:t xml:space="preserve">The precipitation </w:t>
       </w:r>
       <w:proofErr w:type="gramStart"/>

</xml_diff>